<commit_message>
Changes in Genralisation and report
</commit_message>
<xml_diff>
--- a/Group10_Results.docx
+++ b/Group10_Results.docx
@@ -8,10 +8,7 @@
         <w:jc w:val="center"/>
       </w:pPr>
       <w:r>
-        <w:t>Group 10</w:t>
-      </w:r>
-      <w:r>
-        <w:t>: Clustering-Based Ensemble Learning for Bankruptcy Prediction</w:t>
+        <w:t>Group 10: Clustering-Based Ensemble Learning for Bankruptcy Prediction</w:t>
       </w:r>
     </w:p>
     <w:p>
@@ -378,7 +375,7 @@
           </w:tcPr>
           <w:p>
             <w:r>
-              <w:t>40</w:t>
+              <w:t>17</w:t>
             </w:r>
           </w:p>
         </w:tc>
@@ -450,7 +447,7 @@
           </w:tcPr>
           <w:p>
             <w:r>
-              <w:t>40</w:t>
+              <w:t>10</w:t>
             </w:r>
           </w:p>
         </w:tc>
@@ -522,7 +519,7 @@
           </w:tcPr>
           <w:p>
             <w:r>
-              <w:t>40</w:t>
+              <w:t>3</w:t>
             </w:r>
           </w:p>
         </w:tc>
@@ -594,7 +591,7 @@
           </w:tcPr>
           <w:p>
             <w:r>
-              <w:t>40</w:t>
+              <w:t>5</w:t>
             </w:r>
           </w:p>
         </w:tc>
@@ -907,7 +904,10 @@
     </w:p>
     <w:p>
       <w:r>
-        <w:t>Random Forest + SMOTE</w:t>
+        <w:t>Random Forest</w:t>
+      </w:r>
+      <w:r>
+        <w:t xml:space="preserve"> + SMOTE</w:t>
       </w:r>
     </w:p>
     <w:tbl>
@@ -1017,7 +1017,10 @@
     <w:p/>
     <w:p>
       <w:r>
-        <w:t>Gradient Boosting + SMOTE</w:t>
+        <w:t>Gradient Boosting</w:t>
+      </w:r>
+      <w:r>
+        <w:t xml:space="preserve"> + SMOTE</w:t>
       </w:r>
     </w:p>
     <w:tbl>
@@ -1218,7 +1221,7 @@
           </w:tcPr>
           <w:p>
             <w:r>
-              <w:t>1</w:t>
+              <w:t>0</w:t>
             </w:r>
           </w:p>
         </w:tc>
@@ -1228,7 +1231,7 @@
           </w:tcPr>
           <w:p>
             <w:r>
-              <w:t>4</w:t>
+              <w:t>5</w:t>
             </w:r>
           </w:p>
         </w:tc>
@@ -1301,7 +1304,10 @@
           </w:tcPr>
           <w:p>
             <w:r>
-              <w:t>1972</w:t>
+              <w:t>1</w:t>
+            </w:r>
+            <w:r>
+              <w:t>832</w:t>
             </w:r>
           </w:p>
         </w:tc>
@@ -1311,7 +1317,7 @@
           </w:tcPr>
           <w:p>
             <w:r>
-              <w:t>2</w:t>
+              <w:t>142</w:t>
             </w:r>
           </w:p>
         </w:tc>
@@ -1349,7 +1355,6 @@
         </w:tc>
       </w:tr>
     </w:tbl>
-    <w:p/>
     <w:p>
       <w:r>
         <w:t>Results: The model successfully identified all 5 bankruptcies (TT=5, TF=0). The base models (particularly RF and Gradient Boosting) were perfect, while KNN struggled slightly.</w:t>
@@ -1587,7 +1592,10 @@
           </w:tcPr>
           <w:p>
             <w:r>
-              <w:t>2514</w:t>
+              <w:t>25</w:t>
+            </w:r>
+            <w:r>
+              <w:t>28</w:t>
             </w:r>
           </w:p>
         </w:tc>
@@ -1597,7 +1605,7 @@
           </w:tcPr>
           <w:p>
             <w:r>
-              <w:t>31</w:t>
+              <w:t>17</w:t>
             </w:r>
           </w:p>
         </w:tc>
@@ -1807,7 +1815,16 @@
           </w:tcPr>
           <w:p>
             <w:r>
-              <w:t>1679</w:t>
+              <w:t>1</w:t>
+            </w:r>
+            <w:r>
+              <w:t>9</w:t>
+            </w:r>
+            <w:r>
+              <w:t>7</w:t>
+            </w:r>
+            <w:r>
+              <w:t>7</w:t>
             </w:r>
           </w:p>
         </w:tc>
@@ -1817,7 +1834,13 @@
           </w:tcPr>
           <w:p>
             <w:r>
-              <w:t>866</w:t>
+              <w:t>5</w:t>
+            </w:r>
+            <w:r>
+              <w:t>6</w:t>
+            </w:r>
+            <w:r>
+              <w:t>8</w:t>
             </w:r>
           </w:p>
         </w:tc>
@@ -1839,7 +1862,7 @@
           </w:tcPr>
           <w:p>
             <w:r>
-              <w:t>35</w:t>
+              <w:t>14</w:t>
             </w:r>
           </w:p>
         </w:tc>
@@ -1849,7 +1872,7 @@
           </w:tcPr>
           <w:p>
             <w:r>
-              <w:t>40</w:t>
+              <w:t>61</w:t>
             </w:r>
           </w:p>
         </w:tc>
@@ -1922,7 +1945,10 @@
           </w:tcPr>
           <w:p>
             <w:r>
-              <w:t>2313</w:t>
+              <w:t>2</w:t>
+            </w:r>
+            <w:r>
+              <w:t>006</w:t>
             </w:r>
           </w:p>
         </w:tc>
@@ -1932,7 +1958,7 @@
           </w:tcPr>
           <w:p>
             <w:r>
-              <w:t>232</w:t>
+              <w:t>539</w:t>
             </w:r>
           </w:p>
         </w:tc>
@@ -2726,7 +2752,10 @@
           </w:tcPr>
           <w:p>
             <w:r>
-              <w:t>543</w:t>
+              <w:t>54</w:t>
+            </w:r>
+            <w:r>
+              <w:t>2</w:t>
             </w:r>
           </w:p>
         </w:tc>
@@ -2736,7 +2765,7 @@
           </w:tcPr>
           <w:p>
             <w:r>
-              <w:t>0</w:t>
+              <w:t>1</w:t>
             </w:r>
           </w:p>
         </w:tc>
@@ -2758,7 +2787,7 @@
           </w:tcPr>
           <w:p>
             <w:r>
-              <w:t>10</w:t>
+              <w:t>30</w:t>
             </w:r>
           </w:p>
         </w:tc>
@@ -2768,7 +2797,10 @@
           </w:tcPr>
           <w:p>
             <w:r>
-              <w:t>105</w:t>
+              <w:t>8</w:t>
+            </w:r>
+            <w:r>
+              <w:t>5</w:t>
             </w:r>
           </w:p>
         </w:tc>
@@ -2836,7 +2868,10 @@
           </w:tcPr>
           <w:p>
             <w:r>
-              <w:t>532</w:t>
+              <w:t>5</w:t>
+            </w:r>
+            <w:r>
+              <w:t>23</w:t>
             </w:r>
           </w:p>
         </w:tc>
@@ -2846,7 +2881,7 @@
           </w:tcPr>
           <w:p>
             <w:r>
-              <w:t>11</w:t>
+              <w:t>20</w:t>
             </w:r>
           </w:p>
         </w:tc>
@@ -2868,7 +2903,7 @@
           </w:tcPr>
           <w:p>
             <w:r>
-              <w:t>88</w:t>
+              <w:t>52</w:t>
             </w:r>
           </w:p>
         </w:tc>
@@ -2878,7 +2913,7 @@
           </w:tcPr>
           <w:p>
             <w:r>
-              <w:t>27</w:t>
+              <w:t>63</w:t>
             </w:r>
           </w:p>
         </w:tc>
@@ -2951,7 +2986,10 @@
           </w:tcPr>
           <w:p>
             <w:r>
-              <w:t>531</w:t>
+              <w:t>5</w:t>
+            </w:r>
+            <w:r>
+              <w:t>10</w:t>
             </w:r>
           </w:p>
         </w:tc>
@@ -2961,7 +2999,7 @@
           </w:tcPr>
           <w:p>
             <w:r>
-              <w:t>12</w:t>
+              <w:t>33</w:t>
             </w:r>
           </w:p>
         </w:tc>

</xml_diff>